<commit_message>
Deploying to gh-pages from @ ucdavis/win@2c10f5c8967c022a8eec7622daa15f09161b82fc 🚀
</commit_message>
<xml_diff>
--- a/chapters/01-introduction.docx
+++ b/chapters/01-introduction.docx
@@ -918,10 +918,10 @@
       </w:r>
       <m:oMath>
         <m:r>
-          <m:t>P</m:t>
-        </m:r>
-        <m:r>
-          <m:t>r</m:t>
+          <m:rPr>
+            <m:sty m:val="p"/>
+          </m:rPr>
+          <m:t>Pr</m:t>
         </m:r>
         <m:r>
           <m:rPr>
@@ -1010,10 +1010,10 @@
       </w:r>
       <m:oMath>
         <m:r>
-          <m:t>P</m:t>
-        </m:r>
-        <m:r>
-          <m:t>r</m:t>
+          <m:rPr>
+            <m:sty m:val="p"/>
+          </m:rPr>
+          <m:t>Pr</m:t>
         </m:r>
         <m:r>
           <m:rPr>
@@ -1157,10 +1157,10 @@
         </m:oMathParaPr>
         <m:oMath>
           <m:r>
-            <m:t>P</m:t>
-          </m:r>
-          <m:r>
-            <m:t>r</m:t>
+            <m:rPr>
+              <m:sty m:val="p"/>
+            </m:rPr>
+            <m:t>Pr</m:t>
           </m:r>
           <m:r>
             <m:rPr>
@@ -1211,10 +1211,10 @@
             <m:t>≠</m:t>
           </m:r>
           <m:r>
-            <m:t>P</m:t>
-          </m:r>
-          <m:r>
-            <m:t>r</m:t>
+            <m:rPr>
+              <m:sty m:val="p"/>
+            </m:rPr>
+            <m:t>Pr</m:t>
           </m:r>
           <m:r>
             <m:rPr>
@@ -1279,41 +1279,43 @@
         </m:oMathParaPr>
         <m:oMath>
           <m:r>
+            <m:rPr>
+              <m:nor/>
+              <m:sty m:val="p"/>
+            </m:rPr>
             <m:t>E</m:t>
           </m:r>
-          <m:r>
-            <m:rPr>
-              <m:sty m:val="p"/>
-            </m:rPr>
-            <m:t>[</m:t>
-          </m:r>
-          <m:sSup>
+          <m:d>
+            <m:dPr>
+              <m:begChr m:val="["/>
+              <m:sepChr m:val=""/>
+              <m:endChr m:val="]"/>
+              <m:grow/>
+            </m:dPr>
             <m:e>
-              <m:r>
-                <m:t>Y</m:t>
-              </m:r>
+              <m:sSup>
+                <m:e>
+                  <m:r>
+                    <m:t>Y</m:t>
+                  </m:r>
+                </m:e>
+                <m:sup>
+                  <m:r>
+                    <m:t>a</m:t>
+                  </m:r>
+                  <m:r>
+                    <m:rPr>
+                      <m:sty m:val="p"/>
+                    </m:rPr>
+                    <m:t>=</m:t>
+                  </m:r>
+                  <m:r>
+                    <m:t>1</m:t>
+                  </m:r>
+                </m:sup>
+              </m:sSup>
             </m:e>
-            <m:sup>
-              <m:r>
-                <m:t>a</m:t>
-              </m:r>
-              <m:r>
-                <m:rPr>
-                  <m:sty m:val="p"/>
-                </m:rPr>
-                <m:t>=</m:t>
-              </m:r>
-              <m:r>
-                <m:t>1</m:t>
-              </m:r>
-            </m:sup>
-          </m:sSup>
-          <m:r>
-            <m:rPr>
-              <m:sty m:val="p"/>
-            </m:rPr>
-            <m:t>]</m:t>
-          </m:r>
+          </m:d>
           <m:r>
             <m:rPr>
               <m:sty m:val="p"/>
@@ -1321,41 +1323,43 @@
             <m:t>≠</m:t>
           </m:r>
           <m:r>
+            <m:rPr>
+              <m:nor/>
+              <m:sty m:val="p"/>
+            </m:rPr>
             <m:t>E</m:t>
           </m:r>
-          <m:r>
-            <m:rPr>
-              <m:sty m:val="p"/>
-            </m:rPr>
-            <m:t>[</m:t>
-          </m:r>
-          <m:sSup>
+          <m:d>
+            <m:dPr>
+              <m:begChr m:val="["/>
+              <m:sepChr m:val=""/>
+              <m:endChr m:val="]"/>
+              <m:grow/>
+            </m:dPr>
             <m:e>
-              <m:r>
-                <m:t>Y</m:t>
-              </m:r>
+              <m:sSup>
+                <m:e>
+                  <m:r>
+                    <m:t>Y</m:t>
+                  </m:r>
+                </m:e>
+                <m:sup>
+                  <m:r>
+                    <m:t>a</m:t>
+                  </m:r>
+                  <m:r>
+                    <m:rPr>
+                      <m:sty m:val="p"/>
+                    </m:rPr>
+                    <m:t>=</m:t>
+                  </m:r>
+                  <m:r>
+                    <m:t>0</m:t>
+                  </m:r>
+                </m:sup>
+              </m:sSup>
             </m:e>
-            <m:sup>
-              <m:r>
-                <m:t>a</m:t>
-              </m:r>
-              <m:r>
-                <m:rPr>
-                  <m:sty m:val="p"/>
-                </m:rPr>
-                <m:t>=</m:t>
-              </m:r>
-              <m:r>
-                <m:t>0</m:t>
-              </m:r>
-            </m:sup>
-          </m:sSup>
-          <m:r>
-            <m:rPr>
-              <m:sty m:val="p"/>
-            </m:rPr>
-            <m:t>]</m:t>
-          </m:r>
+          </m:d>
         </m:oMath>
       </m:oMathPara>
     </w:p>
@@ -1549,157 +1553,163 @@
       </w:r>
       <m:oMath>
         <m:r>
+          <m:rPr>
+            <m:nor/>
+            <m:sty m:val="p"/>
+          </m:rPr>
           <m:t>E</m:t>
         </m:r>
-        <m:r>
-          <m:rPr>
-            <m:sty m:val="p"/>
-          </m:rPr>
-          <m:t>[</m:t>
-        </m:r>
-        <m:sSup>
+        <m:d>
+          <m:dPr>
+            <m:begChr m:val="["/>
+            <m:sepChr m:val=""/>
+            <m:endChr m:val="]"/>
+            <m:grow/>
+          </m:dPr>
           <m:e>
-            <m:r>
-              <m:t>Y</m:t>
-            </m:r>
+            <m:sSup>
+              <m:e>
+                <m:r>
+                  <m:t>Y</m:t>
+                </m:r>
+              </m:e>
+              <m:sup>
+                <m:r>
+                  <m:t>a</m:t>
+                </m:r>
+                <m:r>
+                  <m:rPr>
+                    <m:sty m:val="p"/>
+                  </m:rPr>
+                  <m:t>=</m:t>
+                </m:r>
+                <m:r>
+                  <m:t>1</m:t>
+                </m:r>
+              </m:sup>
+            </m:sSup>
           </m:e>
-          <m:sup>
-            <m:r>
-              <m:t>a</m:t>
-            </m:r>
+        </m:d>
+        <m:r>
+          <m:rPr>
+            <m:sty m:val="p"/>
+          </m:rPr>
+          <m:t>−</m:t>
+        </m:r>
+        <m:r>
+          <m:rPr>
+            <m:nor/>
+            <m:sty m:val="p"/>
+          </m:rPr>
+          <m:t>E</m:t>
+        </m:r>
+        <m:d>
+          <m:dPr>
+            <m:begChr m:val="["/>
+            <m:sepChr m:val=""/>
+            <m:endChr m:val="]"/>
+            <m:grow/>
+          </m:dPr>
+          <m:e>
+            <m:sSup>
+              <m:e>
+                <m:r>
+                  <m:t>Y</m:t>
+                </m:r>
+              </m:e>
+              <m:sup>
+                <m:r>
+                  <m:t>a</m:t>
+                </m:r>
+                <m:r>
+                  <m:rPr>
+                    <m:sty m:val="p"/>
+                  </m:rPr>
+                  <m:t>=</m:t>
+                </m:r>
+                <m:r>
+                  <m:t>0</m:t>
+                </m:r>
+              </m:sup>
+            </m:sSup>
+          </m:e>
+        </m:d>
+      </m:oMath>
+      <w:r>
+        <w:t xml:space="preserve"> </w:t>
+      </w:r>
+      <w:r>
+        <w:t xml:space="preserve">always equals the average of individual causal effects</w:t>
+      </w:r>
+      <w:r>
+        <w:t xml:space="preserve"> </w:t>
+      </w:r>
+      <m:oMath>
+        <m:r>
+          <m:rPr>
+            <m:nor/>
+            <m:sty m:val="p"/>
+          </m:rPr>
+          <m:t>E</m:t>
+        </m:r>
+        <m:d>
+          <m:dPr>
+            <m:begChr m:val="["/>
+            <m:sepChr m:val=""/>
+            <m:endChr m:val="]"/>
+            <m:grow/>
+          </m:dPr>
+          <m:e>
+            <m:sSup>
+              <m:e>
+                <m:r>
+                  <m:t>Y</m:t>
+                </m:r>
+              </m:e>
+              <m:sup>
+                <m:r>
+                  <m:t>a</m:t>
+                </m:r>
+                <m:r>
+                  <m:rPr>
+                    <m:sty m:val="p"/>
+                  </m:rPr>
+                  <m:t>=</m:t>
+                </m:r>
+                <m:r>
+                  <m:t>1</m:t>
+                </m:r>
+              </m:sup>
+            </m:sSup>
             <m:r>
               <m:rPr>
                 <m:sty m:val="p"/>
               </m:rPr>
-              <m:t>=</m:t>
-            </m:r>
-            <m:r>
-              <m:t>1</m:t>
-            </m:r>
-          </m:sup>
-        </m:sSup>
-        <m:r>
-          <m:rPr>
-            <m:sty m:val="p"/>
-          </m:rPr>
-          <m:t>]</m:t>
-        </m:r>
-        <m:r>
-          <m:rPr>
-            <m:sty m:val="p"/>
-          </m:rPr>
-          <m:t>−</m:t>
-        </m:r>
-        <m:r>
-          <m:t>E</m:t>
-        </m:r>
-        <m:r>
-          <m:rPr>
-            <m:sty m:val="p"/>
-          </m:rPr>
-          <m:t>[</m:t>
-        </m:r>
-        <m:sSup>
-          <m:e>
-            <m:r>
-              <m:t>Y</m:t>
-            </m:r>
+              <m:t>−</m:t>
+            </m:r>
+            <m:sSup>
+              <m:e>
+                <m:r>
+                  <m:t>Y</m:t>
+                </m:r>
+              </m:e>
+              <m:sup>
+                <m:r>
+                  <m:t>a</m:t>
+                </m:r>
+                <m:r>
+                  <m:rPr>
+                    <m:sty m:val="p"/>
+                  </m:rPr>
+                  <m:t>=</m:t>
+                </m:r>
+                <m:r>
+                  <m:t>0</m:t>
+                </m:r>
+              </m:sup>
+            </m:sSup>
           </m:e>
-          <m:sup>
-            <m:r>
-              <m:t>a</m:t>
-            </m:r>
-            <m:r>
-              <m:rPr>
-                <m:sty m:val="p"/>
-              </m:rPr>
-              <m:t>=</m:t>
-            </m:r>
-            <m:r>
-              <m:t>0</m:t>
-            </m:r>
-          </m:sup>
-        </m:sSup>
-        <m:r>
-          <m:rPr>
-            <m:sty m:val="p"/>
-          </m:rPr>
-          <m:t>]</m:t>
-        </m:r>
-      </m:oMath>
-      <w:r>
-        <w:t xml:space="preserve"> </w:t>
-      </w:r>
-      <w:r>
-        <w:t xml:space="preserve">always equals the average of individual causal effects</w:t>
-      </w:r>
-      <w:r>
-        <w:t xml:space="preserve"> </w:t>
-      </w:r>
-      <m:oMath>
-        <m:r>
-          <m:t>E</m:t>
-        </m:r>
-        <m:r>
-          <m:rPr>
-            <m:sty m:val="p"/>
-          </m:rPr>
-          <m:t>[</m:t>
-        </m:r>
-        <m:sSup>
-          <m:e>
-            <m:r>
-              <m:t>Y</m:t>
-            </m:r>
-          </m:e>
-          <m:sup>
-            <m:r>
-              <m:t>a</m:t>
-            </m:r>
-            <m:r>
-              <m:rPr>
-                <m:sty m:val="p"/>
-              </m:rPr>
-              <m:t>=</m:t>
-            </m:r>
-            <m:r>
-              <m:t>1</m:t>
-            </m:r>
-          </m:sup>
-        </m:sSup>
-        <m:r>
-          <m:rPr>
-            <m:sty m:val="p"/>
-          </m:rPr>
-          <m:t>−</m:t>
-        </m:r>
-        <m:sSup>
-          <m:e>
-            <m:r>
-              <m:t>Y</m:t>
-            </m:r>
-          </m:e>
-          <m:sup>
-            <m:r>
-              <m:t>a</m:t>
-            </m:r>
-            <m:r>
-              <m:rPr>
-                <m:sty m:val="p"/>
-              </m:rPr>
-              <m:t>=</m:t>
-            </m:r>
-            <m:r>
-              <m:t>0</m:t>
-            </m:r>
-          </m:sup>
-        </m:sSup>
-        <m:r>
-          <m:rPr>
-            <m:sty m:val="p"/>
-          </m:rPr>
-          <m:t>]</m:t>
-        </m:r>
+        </m:d>
       </m:oMath>
       <w:r>
         <w:t xml:space="preserve">, because a difference of averages equals the average of the differences.</w:t>
@@ -1862,10 +1872,10 @@
         </m:oMathParaPr>
         <m:oMath>
           <m:r>
-            <m:t>P</m:t>
-          </m:r>
-          <m:r>
-            <m:t>r</m:t>
+            <m:rPr>
+              <m:sty m:val="p"/>
+            </m:rPr>
+            <m:t>Pr</m:t>
           </m:r>
           <m:r>
             <m:rPr>
@@ -1916,10 +1926,10 @@
             <m:t>−</m:t>
           </m:r>
           <m:r>
-            <m:t>P</m:t>
-          </m:r>
-          <m:r>
-            <m:t>r</m:t>
+            <m:rPr>
+              <m:sty m:val="p"/>
+            </m:rPr>
+            <m:t>Pr</m:t>
           </m:r>
           <m:r>
             <m:rPr>
@@ -1999,10 +2009,10 @@
             </m:fPr>
             <m:num>
               <m:r>
-                <m:t>P</m:t>
-              </m:r>
-              <m:r>
-                <m:t>r</m:t>
+                <m:rPr>
+                  <m:sty m:val="p"/>
+                </m:rPr>
+                <m:t>Pr</m:t>
               </m:r>
               <m:r>
                 <m:rPr>
@@ -2049,10 +2059,10 @@
             </m:num>
             <m:den>
               <m:r>
-                <m:t>P</m:t>
-              </m:r>
-              <m:r>
-                <m:t>r</m:t>
+                <m:rPr>
+                  <m:sty m:val="p"/>
+                </m:rPr>
+                <m:t>Pr</m:t>
               </m:r>
               <m:r>
                 <m:rPr>
@@ -2134,10 +2144,10 @@
             </m:fPr>
             <m:num>
               <m:r>
-                <m:t>P</m:t>
-              </m:r>
-              <m:r>
-                <m:t>r</m:t>
+                <m:rPr>
+                  <m:sty m:val="p"/>
+                </m:rPr>
+                <m:t>Pr</m:t>
               </m:r>
               <m:r>
                 <m:rPr>
@@ -2188,10 +2198,10 @@
                 <m:t>/</m:t>
               </m:r>
               <m:r>
-                <m:t>P</m:t>
-              </m:r>
-              <m:r>
-                <m:t>r</m:t>
+                <m:rPr>
+                  <m:sty m:val="p"/>
+                </m:rPr>
+                <m:t>Pr</m:t>
               </m:r>
               <m:r>
                 <m:rPr>
@@ -2238,10 +2248,10 @@
             </m:num>
             <m:den>
               <m:r>
-                <m:t>P</m:t>
-              </m:r>
-              <m:r>
-                <m:t>r</m:t>
+                <m:rPr>
+                  <m:sty m:val="p"/>
+                </m:rPr>
+                <m:t>Pr</m:t>
               </m:r>
               <m:r>
                 <m:rPr>
@@ -2292,10 +2302,10 @@
                 <m:t>/</m:t>
               </m:r>
               <m:r>
-                <m:t>P</m:t>
-              </m:r>
-              <m:r>
-                <m:t>r</m:t>
+                <m:rPr>
+                  <m:sty m:val="p"/>
+                </m:rPr>
+                <m:t>Pr</m:t>
               </m:r>
               <m:r>
                 <m:rPr>
@@ -2667,41 +2677,43 @@
       </w:r>
       <m:oMath>
         <m:r>
+          <m:rPr>
+            <m:nor/>
+            <m:sty m:val="p"/>
+          </m:rPr>
           <m:t>E</m:t>
         </m:r>
-        <m:r>
-          <m:rPr>
-            <m:sty m:val="p"/>
-          </m:rPr>
-          <m:t>[</m:t>
-        </m:r>
-        <m:sSup>
+        <m:d>
+          <m:dPr>
+            <m:begChr m:val="["/>
+            <m:sepChr m:val=""/>
+            <m:endChr m:val="]"/>
+            <m:grow/>
+          </m:dPr>
           <m:e>
-            <m:r>
-              <m:t>Y</m:t>
-            </m:r>
+            <m:sSup>
+              <m:e>
+                <m:r>
+                  <m:t>Y</m:t>
+                </m:r>
+              </m:e>
+              <m:sup>
+                <m:r>
+                  <m:t>a</m:t>
+                </m:r>
+                <m:r>
+                  <m:rPr>
+                    <m:sty m:val="p"/>
+                  </m:rPr>
+                  <m:t>=</m:t>
+                </m:r>
+                <m:r>
+                  <m:t>1</m:t>
+                </m:r>
+              </m:sup>
+            </m:sSup>
           </m:e>
-          <m:sup>
-            <m:r>
-              <m:t>a</m:t>
-            </m:r>
-            <m:r>
-              <m:rPr>
-                <m:sty m:val="p"/>
-              </m:rPr>
-              <m:t>=</m:t>
-            </m:r>
-            <m:r>
-              <m:t>1</m:t>
-            </m:r>
-          </m:sup>
-        </m:sSup>
-        <m:r>
-          <m:rPr>
-            <m:sty m:val="p"/>
-          </m:rPr>
-          <m:t>]</m:t>
-        </m:r>
+        </m:d>
         <m:r>
           <m:rPr>
             <m:sty m:val="p"/>
@@ -2709,41 +2721,43 @@
           <m:t>=</m:t>
         </m:r>
         <m:r>
+          <m:rPr>
+            <m:nor/>
+            <m:sty m:val="p"/>
+          </m:rPr>
           <m:t>E</m:t>
         </m:r>
-        <m:r>
-          <m:rPr>
-            <m:sty m:val="p"/>
-          </m:rPr>
-          <m:t>[</m:t>
-        </m:r>
-        <m:sSup>
+        <m:d>
+          <m:dPr>
+            <m:begChr m:val="["/>
+            <m:sepChr m:val=""/>
+            <m:endChr m:val="]"/>
+            <m:grow/>
+          </m:dPr>
           <m:e>
-            <m:r>
-              <m:t>Y</m:t>
-            </m:r>
+            <m:sSup>
+              <m:e>
+                <m:r>
+                  <m:t>Y</m:t>
+                </m:r>
+              </m:e>
+              <m:sup>
+                <m:r>
+                  <m:t>a</m:t>
+                </m:r>
+                <m:r>
+                  <m:rPr>
+                    <m:sty m:val="p"/>
+                  </m:rPr>
+                  <m:t>=</m:t>
+                </m:r>
+                <m:r>
+                  <m:t>0</m:t>
+                </m:r>
+              </m:sup>
+            </m:sSup>
           </m:e>
-          <m:sup>
-            <m:r>
-              <m:t>a</m:t>
-            </m:r>
-            <m:r>
-              <m:rPr>
-                <m:sty m:val="p"/>
-              </m:rPr>
-              <m:t>=</m:t>
-            </m:r>
-            <m:r>
-              <m:t>0</m:t>
-            </m:r>
-          </m:sup>
-        </m:sSup>
-        <m:r>
-          <m:rPr>
-            <m:sty m:val="p"/>
-          </m:rPr>
-          <m:t>]</m:t>
-        </m:r>
+        </m:d>
         <m:r>
           <m:rPr>
             <m:sty m:val="p"/>
@@ -2770,43 +2784,45 @@
           </m:accPr>
           <m:e>
             <m:r>
+              <m:rPr>
+                <m:nor/>
+                <m:sty m:val="p"/>
+              </m:rPr>
               <m:t>E</m:t>
             </m:r>
           </m:e>
         </m:acc>
-        <m:r>
-          <m:rPr>
-            <m:sty m:val="p"/>
-          </m:rPr>
-          <m:t>[</m:t>
-        </m:r>
-        <m:sSup>
+        <m:d>
+          <m:dPr>
+            <m:begChr m:val="["/>
+            <m:sepChr m:val=""/>
+            <m:endChr m:val="]"/>
+            <m:grow/>
+          </m:dPr>
           <m:e>
-            <m:r>
-              <m:t>Y</m:t>
-            </m:r>
+            <m:sSup>
+              <m:e>
+                <m:r>
+                  <m:t>Y</m:t>
+                </m:r>
+              </m:e>
+              <m:sup>
+                <m:r>
+                  <m:t>a</m:t>
+                </m:r>
+                <m:r>
+                  <m:rPr>
+                    <m:sty m:val="p"/>
+                  </m:rPr>
+                  <m:t>=</m:t>
+                </m:r>
+                <m:r>
+                  <m:t>1</m:t>
+                </m:r>
+              </m:sup>
+            </m:sSup>
           </m:e>
-          <m:sup>
-            <m:r>
-              <m:t>a</m:t>
-            </m:r>
-            <m:r>
-              <m:rPr>
-                <m:sty m:val="p"/>
-              </m:rPr>
-              <m:t>=</m:t>
-            </m:r>
-            <m:r>
-              <m:t>1</m:t>
-            </m:r>
-          </m:sup>
-        </m:sSup>
-        <m:r>
-          <m:rPr>
-            <m:sty m:val="p"/>
-          </m:rPr>
-          <m:t>]</m:t>
-        </m:r>
+        </m:d>
         <m:r>
           <m:rPr>
             <m:sty m:val="p"/>
@@ -2833,43 +2849,45 @@
           </m:accPr>
           <m:e>
             <m:r>
+              <m:rPr>
+                <m:nor/>
+                <m:sty m:val="p"/>
+              </m:rPr>
               <m:t>E</m:t>
             </m:r>
           </m:e>
         </m:acc>
-        <m:r>
-          <m:rPr>
-            <m:sty m:val="p"/>
-          </m:rPr>
-          <m:t>[</m:t>
-        </m:r>
-        <m:sSup>
+        <m:d>
+          <m:dPr>
+            <m:begChr m:val="["/>
+            <m:sepChr m:val=""/>
+            <m:endChr m:val="]"/>
+            <m:grow/>
+          </m:dPr>
           <m:e>
-            <m:r>
-              <m:t>Y</m:t>
-            </m:r>
+            <m:sSup>
+              <m:e>
+                <m:r>
+                  <m:t>Y</m:t>
+                </m:r>
+              </m:e>
+              <m:sup>
+                <m:r>
+                  <m:t>a</m:t>
+                </m:r>
+                <m:r>
+                  <m:rPr>
+                    <m:sty m:val="p"/>
+                  </m:rPr>
+                  <m:t>=</m:t>
+                </m:r>
+                <m:r>
+                  <m:t>0</m:t>
+                </m:r>
+              </m:sup>
+            </m:sSup>
           </m:e>
-          <m:sup>
-            <m:r>
-              <m:t>a</m:t>
-            </m:r>
-            <m:r>
-              <m:rPr>
-                <m:sty m:val="p"/>
-              </m:rPr>
-              <m:t>=</m:t>
-            </m:r>
-            <m:r>
-              <m:t>0</m:t>
-            </m:r>
-          </m:sup>
-        </m:sSup>
-        <m:r>
-          <m:rPr>
-            <m:sty m:val="p"/>
-          </m:rPr>
-          <m:t>]</m:t>
-        </m:r>
+        </m:d>
         <m:r>
           <m:rPr>
             <m:sty m:val="p"/>
@@ -3158,10 +3176,10 @@
       </w:r>
       <m:oMath>
         <m:r>
-          <m:t>P</m:t>
-        </m:r>
-        <m:r>
-          <m:t>r</m:t>
+          <m:rPr>
+            <m:sty m:val="p"/>
+          </m:rPr>
+          <m:t>Pr</m:t>
         </m:r>
         <m:r>
           <m:rPr>
@@ -3253,10 +3271,10 @@
       </w:r>
       <m:oMath>
         <m:r>
-          <m:t>P</m:t>
-        </m:r>
-        <m:r>
-          <m:t>r</m:t>
+          <m:rPr>
+            <m:sty m:val="p"/>
+          </m:rPr>
+          <m:t>Pr</m:t>
         </m:r>
         <m:r>
           <m:rPr>
@@ -3392,10 +3410,10 @@
         </m:oMathParaPr>
         <m:oMath>
           <m:r>
-            <m:t>P</m:t>
-          </m:r>
-          <m:r>
-            <m:t>r</m:t>
+            <m:rPr>
+              <m:sty m:val="p"/>
+            </m:rPr>
+            <m:t>Pr</m:t>
           </m:r>
           <m:r>
             <m:rPr>
@@ -3446,10 +3464,10 @@
             <m:t>=</m:t>
           </m:r>
           <m:r>
-            <m:t>P</m:t>
-          </m:r>
-          <m:r>
-            <m:t>r</m:t>
+            <m:rPr>
+              <m:sty m:val="p"/>
+            </m:rPr>
+            <m:t>Pr</m:t>
           </m:r>
           <m:r>
             <m:rPr>
@@ -3508,26 +3526,43 @@
       </w:r>
       <m:oMath>
         <m:r>
+          <m:rPr>
+            <m:nor/>
+            <m:sty m:val="p"/>
+          </m:rPr>
           <m:t>E</m:t>
         </m:r>
-        <m:r>
-          <m:rPr>
-            <m:sty m:val="p"/>
-          </m:rPr>
-          <m:t>[</m:t>
-        </m:r>
-        <m:r>
-          <m:t>Y</m:t>
-        </m:r>
-        <m:r>
-          <m:rPr>
-            <m:sty m:val="p"/>
-          </m:rPr>
-          <m:t>|</m:t>
-        </m:r>
-        <m:r>
-          <m:t>A</m:t>
-        </m:r>
+        <m:d>
+          <m:dPr>
+            <m:begChr m:val="["/>
+            <m:sepChr m:val=""/>
+            <m:endChr m:val="]"/>
+            <m:grow/>
+          </m:dPr>
+          <m:e>
+            <m:r>
+              <m:t>Y</m:t>
+            </m:r>
+            <m:r>
+              <m:rPr>
+                <m:sty m:val="p"/>
+              </m:rPr>
+              <m:t>|</m:t>
+            </m:r>
+            <m:r>
+              <m:t>A</m:t>
+            </m:r>
+            <m:r>
+              <m:rPr>
+                <m:sty m:val="p"/>
+              </m:rPr>
+              <m:t>=</m:t>
+            </m:r>
+            <m:r>
+              <m:t>1</m:t>
+            </m:r>
+          </m:e>
+        </m:d>
         <m:r>
           <m:rPr>
             <m:sty m:val="p"/>
@@ -3535,56 +3570,43 @@
           <m:t>=</m:t>
         </m:r>
         <m:r>
-          <m:t>1</m:t>
-        </m:r>
-        <m:r>
-          <m:rPr>
-            <m:sty m:val="p"/>
-          </m:rPr>
-          <m:t>]</m:t>
-        </m:r>
-        <m:r>
-          <m:rPr>
-            <m:sty m:val="p"/>
-          </m:rPr>
-          <m:t>=</m:t>
-        </m:r>
-        <m:r>
+          <m:rPr>
+            <m:nor/>
+            <m:sty m:val="p"/>
+          </m:rPr>
           <m:t>E</m:t>
         </m:r>
-        <m:r>
-          <m:rPr>
-            <m:sty m:val="p"/>
-          </m:rPr>
-          <m:t>[</m:t>
-        </m:r>
-        <m:r>
-          <m:t>Y</m:t>
-        </m:r>
-        <m:r>
-          <m:rPr>
-            <m:sty m:val="p"/>
-          </m:rPr>
-          <m:t>|</m:t>
-        </m:r>
-        <m:r>
-          <m:t>A</m:t>
-        </m:r>
-        <m:r>
-          <m:rPr>
-            <m:sty m:val="p"/>
-          </m:rPr>
-          <m:t>=</m:t>
-        </m:r>
-        <m:r>
-          <m:t>0</m:t>
-        </m:r>
-        <m:r>
-          <m:rPr>
-            <m:sty m:val="p"/>
-          </m:rPr>
-          <m:t>]</m:t>
-        </m:r>
+        <m:d>
+          <m:dPr>
+            <m:begChr m:val="["/>
+            <m:sepChr m:val=""/>
+            <m:endChr m:val="]"/>
+            <m:grow/>
+          </m:dPr>
+          <m:e>
+            <m:r>
+              <m:t>Y</m:t>
+            </m:r>
+            <m:r>
+              <m:rPr>
+                <m:sty m:val="p"/>
+              </m:rPr>
+              <m:t>|</m:t>
+            </m:r>
+            <m:r>
+              <m:t>A</m:t>
+            </m:r>
+            <m:r>
+              <m:rPr>
+                <m:sty m:val="p"/>
+              </m:rPr>
+              <m:t>=</m:t>
+            </m:r>
+            <m:r>
+              <m:t>0</m:t>
+            </m:r>
+          </m:e>
+        </m:d>
       </m:oMath>
     </w:p>
     <w:p>
@@ -3718,10 +3740,10 @@
       </w:r>
       <m:oMath>
         <m:r>
-          <m:t>P</m:t>
-        </m:r>
-        <m:r>
-          <m:t>r</m:t>
+          <m:rPr>
+            <m:sty m:val="p"/>
+          </m:rPr>
+          <m:t>Pr</m:t>
         </m:r>
         <m:r>
           <m:rPr>
@@ -3772,10 +3794,10 @@
           <m:t>−</m:t>
         </m:r>
         <m:r>
-          <m:t>P</m:t>
-        </m:r>
-        <m:r>
-          <m:t>r</m:t>
+          <m:rPr>
+            <m:sty m:val="p"/>
+          </m:rPr>
+          <m:t>Pr</m:t>
         </m:r>
         <m:r>
           <m:rPr>
@@ -3844,10 +3866,10 @@
       </w:r>
       <m:oMath>
         <m:r>
-          <m:t>P</m:t>
-        </m:r>
-        <m:r>
-          <m:t>r</m:t>
+          <m:rPr>
+            <m:sty m:val="p"/>
+          </m:rPr>
+          <m:t>Pr</m:t>
         </m:r>
         <m:r>
           <m:rPr>
@@ -3898,10 +3920,10 @@
           <m:t>/</m:t>
         </m:r>
         <m:r>
-          <m:t>P</m:t>
-        </m:r>
-        <m:r>
-          <m:t>r</m:t>
+          <m:rPr>
+            <m:sty m:val="p"/>
+          </m:rPr>
+          <m:t>Pr</m:t>
         </m:r>
         <m:r>
           <m:rPr>
@@ -3978,10 +4000,10 @@
           </m:fPr>
           <m:num>
             <m:r>
-              <m:t>P</m:t>
-            </m:r>
-            <m:r>
-              <m:t>r</m:t>
+              <m:rPr>
+                <m:sty m:val="p"/>
+              </m:rPr>
+              <m:t>Pr</m:t>
             </m:r>
             <m:r>
               <m:rPr>
@@ -4032,10 +4054,10 @@
               <m:t>/</m:t>
             </m:r>
             <m:r>
-              <m:t>P</m:t>
-            </m:r>
-            <m:r>
-              <m:t>r</m:t>
+              <m:rPr>
+                <m:sty m:val="p"/>
+              </m:rPr>
+              <m:t>Pr</m:t>
             </m:r>
             <m:r>
               <m:rPr>
@@ -4082,10 +4104,10 @@
           </m:num>
           <m:den>
             <m:r>
-              <m:t>P</m:t>
-            </m:r>
-            <m:r>
-              <m:t>r</m:t>
+              <m:rPr>
+                <m:sty m:val="p"/>
+              </m:rPr>
+              <m:t>Pr</m:t>
             </m:r>
             <m:r>
               <m:rPr>
@@ -4136,10 +4158,10 @@
               <m:t>/</m:t>
             </m:r>
             <m:r>
-              <m:t>P</m:t>
-            </m:r>
-            <m:r>
-              <m:t>r</m:t>
+              <m:rPr>
+                <m:sty m:val="p"/>
+              </m:rPr>
+              <m:t>Pr</m:t>
             </m:r>
             <m:r>
               <m:rPr>
@@ -4228,10 +4250,10 @@
       </w:r>
       <m:oMath>
         <m:r>
-          <m:t>P</m:t>
-        </m:r>
-        <m:r>
-          <m:t>r</m:t>
+          <m:rPr>
+            <m:sty m:val="p"/>
+          </m:rPr>
+          <m:t>Pr</m:t>
         </m:r>
         <m:r>
           <m:rPr>
@@ -4282,10 +4304,10 @@
           <m:t>=</m:t>
         </m:r>
         <m:r>
-          <m:t>P</m:t>
-        </m:r>
-        <m:r>
-          <m:t>r</m:t>
+          <m:rPr>
+            <m:sty m:val="p"/>
+          </m:rPr>
+          <m:t>Pr</m:t>
         </m:r>
         <m:r>
           <m:rPr>
@@ -4363,10 +4385,10 @@
       </w:r>
       <m:oMath>
         <m:r>
-          <m:t>P</m:t>
-        </m:r>
-        <m:r>
-          <m:t>r</m:t>
+          <m:rPr>
+            <m:sty m:val="p"/>
+          </m:rPr>
+          <m:t>Pr</m:t>
         </m:r>
         <m:r>
           <m:rPr>
@@ -4435,10 +4457,10 @@
           <m:t>=</m:t>
         </m:r>
         <m:r>
-          <m:t>P</m:t>
-        </m:r>
-        <m:r>
-          <m:t>r</m:t>
+          <m:rPr>
+            <m:sty m:val="p"/>
+          </m:rPr>
+          <m:t>Pr</m:t>
         </m:r>
         <m:r>
           <m:rPr>
@@ -4585,10 +4607,10 @@
       </w:r>
       <m:oMath>
         <m:r>
-          <m:t>P</m:t>
-        </m:r>
-        <m:r>
-          <m:t>r</m:t>
+          <m:rPr>
+            <m:sty m:val="p"/>
+          </m:rPr>
+          <m:t>Pr</m:t>
         </m:r>
         <m:r>
           <m:rPr>
@@ -4641,10 +4663,10 @@
       </w:r>
       <m:oMath>
         <m:r>
-          <m:t>P</m:t>
-        </m:r>
-        <m:r>
-          <m:t>r</m:t>
+          <m:rPr>
+            <m:sty m:val="p"/>
+          </m:rPr>
+          <m:t>Pr</m:t>
         </m:r>
         <m:r>
           <m:rPr>
@@ -4762,10 +4784,10 @@
       </w:r>
       <m:oMath>
         <m:r>
-          <m:t>P</m:t>
-        </m:r>
-        <m:r>
-          <m:t>r</m:t>
+          <m:rPr>
+            <m:sty m:val="p"/>
+          </m:rPr>
+          <m:t>Pr</m:t>
         </m:r>
         <m:r>
           <m:rPr>
@@ -4818,10 +4840,10 @@
       </w:r>
       <m:oMath>
         <m:r>
-          <m:t>P</m:t>
-        </m:r>
-        <m:r>
-          <m:t>r</m:t>
+          <m:rPr>
+            <m:sty m:val="p"/>
+          </m:rPr>
+          <m:t>Pr</m:t>
         </m:r>
         <m:r>
           <m:rPr>
@@ -5039,41 +5061,43 @@
       </w:r>
       <m:oMath>
         <m:r>
+          <m:rPr>
+            <m:nor/>
+            <m:sty m:val="p"/>
+          </m:rPr>
           <m:t>E</m:t>
         </m:r>
-        <m:r>
-          <m:rPr>
-            <m:sty m:val="p"/>
-          </m:rPr>
-          <m:t>[</m:t>
-        </m:r>
-        <m:sSup>
+        <m:d>
+          <m:dPr>
+            <m:begChr m:val="["/>
+            <m:sepChr m:val=""/>
+            <m:endChr m:val="]"/>
+            <m:grow/>
+          </m:dPr>
           <m:e>
-            <m:r>
-              <m:t>Y</m:t>
-            </m:r>
+            <m:sSup>
+              <m:e>
+                <m:r>
+                  <m:t>Y</m:t>
+                </m:r>
+              </m:e>
+              <m:sup>
+                <m:r>
+                  <m:t>a</m:t>
+                </m:r>
+                <m:r>
+                  <m:rPr>
+                    <m:sty m:val="p"/>
+                  </m:rPr>
+                  <m:t>=</m:t>
+                </m:r>
+                <m:r>
+                  <m:t>1</m:t>
+                </m:r>
+              </m:sup>
+            </m:sSup>
           </m:e>
-          <m:sup>
-            <m:r>
-              <m:t>a</m:t>
-            </m:r>
-            <m:r>
-              <m:rPr>
-                <m:sty m:val="p"/>
-              </m:rPr>
-              <m:t>=</m:t>
-            </m:r>
-            <m:r>
-              <m:t>1</m:t>
-            </m:r>
-          </m:sup>
-        </m:sSup>
-        <m:r>
-          <m:rPr>
-            <m:sty m:val="p"/>
-          </m:rPr>
-          <m:t>]</m:t>
-        </m:r>
+        </m:d>
         <m:r>
           <m:rPr>
             <m:sty m:val="p"/>
@@ -5081,41 +5105,43 @@
           <m:t>≠</m:t>
         </m:r>
         <m:r>
+          <m:rPr>
+            <m:nor/>
+            <m:sty m:val="p"/>
+          </m:rPr>
           <m:t>E</m:t>
         </m:r>
-        <m:r>
-          <m:rPr>
-            <m:sty m:val="p"/>
-          </m:rPr>
-          <m:t>[</m:t>
-        </m:r>
-        <m:sSup>
+        <m:d>
+          <m:dPr>
+            <m:begChr m:val="["/>
+            <m:sepChr m:val=""/>
+            <m:endChr m:val="]"/>
+            <m:grow/>
+          </m:dPr>
           <m:e>
-            <m:r>
-              <m:t>Y</m:t>
-            </m:r>
+            <m:sSup>
+              <m:e>
+                <m:r>
+                  <m:t>Y</m:t>
+                </m:r>
+              </m:e>
+              <m:sup>
+                <m:r>
+                  <m:t>a</m:t>
+                </m:r>
+                <m:r>
+                  <m:rPr>
+                    <m:sty m:val="p"/>
+                  </m:rPr>
+                  <m:t>=</m:t>
+                </m:r>
+                <m:r>
+                  <m:t>0</m:t>
+                </m:r>
+              </m:sup>
+            </m:sSup>
           </m:e>
-          <m:sup>
-            <m:r>
-              <m:t>a</m:t>
-            </m:r>
-            <m:r>
-              <m:rPr>
-                <m:sty m:val="p"/>
-              </m:rPr>
-              <m:t>=</m:t>
-            </m:r>
-            <m:r>
-              <m:t>0</m:t>
-            </m:r>
-          </m:sup>
-        </m:sSup>
-        <m:r>
-          <m:rPr>
-            <m:sty m:val="p"/>
-          </m:rPr>
-          <m:t>]</m:t>
-        </m:r>
+        </m:d>
       </m:oMath>
       <w:r>
         <w:t xml:space="preserve">, can sometimes be identified from data</w:t>

</xml_diff>